<commit_message>
Ajustar estilos visuales del frontend
</commit_message>
<xml_diff>
--- a/FASE-1/EVIDENCIAS-GRUPALES/DEFINICION-PROYECTO-APT.docx
+++ b/FASE-1/EVIDENCIAS-GRUPALES/DEFINICION-PROYECTO-APT.docx
@@ -201,7 +201,7 @@
     </w:p>
     <w:sdt>
       <w:sdtPr>
-        <w:id w:val="1593749643"/>
+        <w:id w:val="1843738667"/>
         <w:docPartObj>
           <w:docPartGallery w:val="Table of Contents"/>
           <w:docPartUnique w:val="1"/>
@@ -1606,7 +1606,7 @@
     <w:sdt>
       <w:sdtPr>
         <w:lock w:val="contentLocked"/>
-        <w:id w:val="-716420847"/>
+        <w:id w:val="2092554327"/>
         <w:tag w:val="goog_rdk_0"/>
       </w:sdtPr>
       <w:sdtContent>
@@ -1943,7 +1943,7 @@
     <w:sdt>
       <w:sdtPr>
         <w:lock w:val="contentLocked"/>
-        <w:id w:val="2121124050"/>
+        <w:id w:val="1431720990"/>
         <w:tag w:val="goog_rdk_2"/>
       </w:sdtPr>
       <w:sdtContent>
@@ -2336,7 +2336,7 @@
                 </w:r>
                 <w:sdt>
                   <w:sdtPr>
-                    <w:id w:val="-1627272974"/>
+                    <w:id w:val="-1103575658"/>
                     <w:tag w:val="goog_rdk_1"/>
                   </w:sdtPr>
                   <w:sdtContent>
@@ -4967,7 +4967,7 @@
     <w:sdt>
       <w:sdtPr>
         <w:lock w:val="contentLocked"/>
-        <w:id w:val="726255376"/>
+        <w:id w:val="-362975496"/>
         <w:tag w:val="goog_rdk_3"/>
       </w:sdtPr>
       <w:sdtContent>
@@ -7044,7 +7044,7 @@
     <w:sdt>
       <w:sdtPr>
         <w:lock w:val="contentLocked"/>
-        <w:id w:val="117674653"/>
+        <w:id w:val="-1759505523"/>
         <w:tag w:val="goog_rdk_4"/>
       </w:sdtPr>
       <w:sdtContent>
@@ -7907,7 +7907,7 @@
       <w:bookmarkEnd w:id="27"/>
       <w:sdt>
         <w:sdtPr>
-          <w:id w:val="1633743866"/>
+          <w:id w:val="141827379"/>
           <w:tag w:val="goog_rdk_5"/>
         </w:sdtPr>
         <w:sdtContent>
@@ -9256,12 +9256,12 @@
           <wp:extent cx="932815" cy="231775"/>
           <wp:effectExtent b="0" l="0" r="0" t="0"/>
           <wp:wrapSquare wrapText="bothSides" distB="0" distT="0" distL="114300" distR="114300"/>
-          <wp:docPr id="89" name="image1.png"/>
+          <wp:docPr id="89" name="image2.png"/>
           <a:graphic>
             <a:graphicData uri="http://schemas.openxmlformats.org/drawingml/2006/picture">
               <pic:pic>
                 <pic:nvPicPr>
-                  <pic:cNvPr id="0" name="image1.png"/>
+                  <pic:cNvPr id="0" name="image2.png"/>
                   <pic:cNvPicPr preferRelativeResize="0"/>
                 </pic:nvPicPr>
                 <pic:blipFill>
@@ -9348,12 +9348,12 @@
           <wp:extent cx="2490788" cy="412112"/>
           <wp:effectExtent b="0" l="0" r="0" t="0"/>
           <wp:wrapNone/>
-          <wp:docPr id="88" name="image2.jpg"/>
+          <wp:docPr id="88" name="image1.jpg"/>
           <a:graphic>
             <a:graphicData uri="http://schemas.openxmlformats.org/drawingml/2006/picture">
               <pic:pic>
                 <pic:nvPicPr>
-                  <pic:cNvPr id="0" name="image2.jpg"/>
+                  <pic:cNvPr id="0" name="image1.jpg"/>
                   <pic:cNvPicPr preferRelativeResize="0"/>
                 </pic:nvPicPr>
                 <pic:blipFill>

</xml_diff>